<commit_message>
📄 Bug Report Halyzia vV1.7.1 — généré automatiquement
</commit_message>
<xml_diff>
--- a/reports/Bug_Report_Halyzia_VV1.7.1.docx
+++ b/reports/Bug_Report_Halyzia_VV1.7.1.docx
@@ -13,7 +13,7 @@
     </w:p>
     <w:p>
       <w:pPr>
-        <w:spacing w:after="200"/>
+        <w:spacing w:after="300"/>
       </w:pPr>
       <w:r>
         <w:t xml:space="preserve">Tests démarrés automatiquement via GitHub Actions</w:t>
@@ -104,7 +104,7 @@
     </w:p>
     <w:p>
       <w:pPr>
-        <w:spacing w:before="200"/>
+        <w:spacing w:before="300"/>
       </w:pPr>
       <w:r>
         <w:t xml:space="preserve">Surlignage équipe test :</w:t>
@@ -142,7 +142,7 @@
         <w:spacing w:before="400" w:after="200"/>
       </w:pPr>
       <w:r>
-        <w:t xml:space="preserve">Issue n°43: Issue Utilisateur</w:t>
+        <w:t xml:space="preserve">Issue n°44: [Back log]</w:t>
       </w:r>
     </w:p>
     <w:tbl>
@@ -233,7 +233,7 @@
         <w:tc>
           <w:p>
             <w:r>
-              <w:t xml:space="preserve">Critique — crash / perte de donnees</w:t>
+              <w:t xml:space="preserve">Mineur</w:t>
             </w:r>
           </w:p>
         </w:tc>
@@ -244,51 +244,44 @@
         <w:spacing w:before="200"/>
       </w:pPr>
       <w:r>
-        <w:t xml:space="preserve">Description détaillée :</w:t>
-      </w:r>
-    </w:p>
-    <w:p>
-      <w:r>
-        <w:t xml:space="preserve">git add .
-git rebase --continue
-git push</w:t>
-      </w:r>
-    </w:p>
-    <w:p>
-      <w:pPr>
-        <w:spacing w:before="200"/>
-      </w:pPr>
-      <w:r>
-        <w:t xml:space="preserve">Étapes pour reproduire :</w:t>
-      </w:r>
-    </w:p>
-    <w:p>
-      <w:r>
-        <w:t xml:space="preserve">git add .
-git rebase --continue
-git push</w:t>
-      </w:r>
-    </w:p>
-    <w:p>
-      <w:pPr>
-        <w:spacing w:before="200"/>
-      </w:pPr>
-      <w:r>
-        <w:t xml:space="preserve">Logs / Traceback :</w:t>
-      </w:r>
-    </w:p>
-    <w:p>
-      <w:pPr>
-        <w:jc w:val="left"/>
-      </w:pPr>
-      <w:r>
-        <w:t xml:space="preserve">(copier-coller depuis le terminal)
-```shell
-git add .
-git rebase --continue
-git push
-```</w:t>
-      </w:r>
+        <w:t xml:space="preserve">Description :</w:t>
+      </w:r>
+    </w:p>
+    <w:p>
+      <w:r>
+        <w:t xml:space="preserve">git add . git rebase --continue git push</w:t>
+      </w:r>
+    </w:p>
+    <w:p>
+      <w:pPr>
+        <w:spacing w:before="200"/>
+      </w:pPr>
+      <w:r>
+        <w:t xml:space="preserve">Milestone :</w:t>
+      </w:r>
+    </w:p>
+    <w:p>
+      <w:r>
+        <w:t xml:space="preserve">git add . git rebase --continue git push</w:t>
+      </w:r>
+    </w:p>
+    <w:p>
+      <w:pPr>
+        <w:spacing w:before="200"/>
+      </w:pPr>
+      <w:r>
+        <w:t xml:space="preserve">Commentaire :</w:t>
+      </w:r>
+    </w:p>
+    <w:p>
+      <w:r>
+        <w:t xml:space="preserve">git add . git rebase --continue git push</w:t>
+      </w:r>
+    </w:p>
+    <w:p>
+      <w:pPr>
+        <w:spacing w:after="300"/>
+      </w:pPr>
     </w:p>
     <w:p>
       <w:pPr>
@@ -296,7 +289,7 @@
         <w:spacing w:before="400" w:after="200"/>
       </w:pPr>
       <w:r>
-        <w:t xml:space="preserve">Issue n°42: Issue Test</w:t>
+        <w:t xml:space="preserve">Issue n°43: Issue Utilisateur</w:t>
       </w:r>
     </w:p>
     <w:tbl>
@@ -366,7 +359,7 @@
         <w:tc>
           <w:p>
             <w:r>
-              <w:t xml:space="preserve">31/03/2026</w:t>
+              <w:t xml:space="preserve">01/04/2026</w:t>
             </w:r>
           </w:p>
         </w:tc>
@@ -398,12 +391,84 @@
         <w:spacing w:before="200"/>
       </w:pPr>
       <w:r>
-        <w:t xml:space="preserve">Description détaillée :</w:t>
-      </w:r>
-    </w:p>
-    <w:p>
-      <w:r>
-        <w:t xml:space="preserve">hhhhhhhhhhh</w:t>
+        <w:t xml:space="preserve">Version concernée :</w:t>
+      </w:r>
+    </w:p>
+    <w:p>
+      <w:r>
+        <w:t xml:space="preserve">Halyzia concernee
+V1.7.1</w:t>
+      </w:r>
+    </w:p>
+    <w:p>
+      <w:pPr>
+        <w:spacing w:before="200"/>
+      </w:pPr>
+      <w:r>
+        <w:t xml:space="preserve">Workflow :</w:t>
+      </w:r>
+    </w:p>
+    <w:p>
+      <w:r>
+        <w:t xml:space="preserve">en cours quand le bug est apparu
+""</w:t>
+      </w:r>
+    </w:p>
+    <w:p>
+      <w:pPr>
+        <w:spacing w:before="200"/>
+      </w:pPr>
+      <w:r>
+        <w:t xml:space="preserve">Format du fichier :</w:t>
+      </w:r>
+    </w:p>
+    <w:p>
+      <w:r>
+        <w:t xml:space="preserve">du fichier EEG utilise
+.ncs</w:t>
+      </w:r>
+    </w:p>
+    <w:p>
+      <w:pPr>
+        <w:spacing w:before="200"/>
+      </w:pPr>
+      <w:r>
+        <w:t xml:space="preserve">PC utilisé :</w:t>
+      </w:r>
+    </w:p>
+    <w:p>
+      <w:r>
+        <w:t xml:space="preserve">utilise
+git add . git rebgit add . git rebase --continue git pushase --continue git push</w:t>
+      </w:r>
+    </w:p>
+    <w:p>
+      <w:pPr>
+        <w:spacing w:before="200"/>
+      </w:pPr>
+      <w:r>
+        <w:t xml:space="preserve">Testeur :</w:t>
+      </w:r>
+    </w:p>
+    <w:p>
+      <w:r>
+        <w:t xml:space="preserve">git agit add . git rebase --continue git pushdd . git rebase --continue git push</w:t>
+      </w:r>
+    </w:p>
+    <w:p>
+      <w:pPr>
+        <w:spacing w:before="200"/>
+      </w:pPr>
+      <w:r>
+        <w:t xml:space="preserve">Description :</w:t>
+      </w:r>
+    </w:p>
+    <w:p>
+      <w:r>
+        <w:t xml:space="preserve">du bug
+git add .
+git rebase --continue
+git push</w:t>
       </w:r>
     </w:p>
     <w:p>
@@ -416,26 +481,33 @@
     </w:p>
     <w:p>
       <w:r>
-        <w:t xml:space="preserve">hhhhhhhhhhh</w:t>
-      </w:r>
-    </w:p>
-    <w:p>
-      <w:pPr>
-        <w:spacing w:before="200"/>
-      </w:pPr>
-      <w:r>
-        <w:t xml:space="preserve">Logs / Traceback :</w:t>
-      </w:r>
-    </w:p>
-    <w:p>
-      <w:pPr>
-        <w:jc w:val="left"/>
-      </w:pPr>
+        <w:t xml:space="preserve">git add .
+git rebase --continue
+git push</w:t>
+      </w:r>
+    </w:p>
+    <w:p>
+      <w:pPr>
+        <w:spacing w:before="200"/>
+      </w:pPr>
+      <w:r>
+        <w:t xml:space="preserve">Logs / Erreurs :</w:t>
+      </w:r>
+    </w:p>
+    <w:p>
       <w:r>
         <w:t xml:space="preserve">(copier-coller depuis le terminal)
 ```shell
+git add .
+git rebase --continue
+git push
 ```</w:t>
       </w:r>
+    </w:p>
+    <w:p>
+      <w:pPr>
+        <w:spacing w:after="300"/>
+      </w:pPr>
     </w:p>
     <w:p>
       <w:pPr>
@@ -443,7 +515,7 @@
         <w:spacing w:before="400" w:after="200"/>
       </w:pPr>
       <w:r>
-        <w:t xml:space="preserve">Issue n°40: Issue Test</w:t>
+        <w:t xml:space="preserve">Issue n°42: Issue Test</w:t>
       </w:r>
     </w:p>
     <w:tbl>
@@ -545,7 +617,282 @@
         <w:spacing w:before="200"/>
       </w:pPr>
       <w:r>
-        <w:t xml:space="preserve">Description détaillée :</w:t>
+        <w:t xml:space="preserve">Version concernée :</w:t>
+      </w:r>
+    </w:p>
+    <w:p>
+      <w:r>
+        <w:t xml:space="preserve">Halyzia concernee
+V1.7.1</w:t>
+      </w:r>
+    </w:p>
+    <w:p>
+      <w:pPr>
+        <w:spacing w:before="200"/>
+      </w:pPr>
+      <w:r>
+        <w:t xml:space="preserve">Workflow :</w:t>
+      </w:r>
+    </w:p>
+    <w:p>
+      <w:r>
+        <w:t xml:space="preserve">en cours quand le bug est apparu
+""</w:t>
+      </w:r>
+    </w:p>
+    <w:p>
+      <w:pPr>
+        <w:spacing w:before="200"/>
+      </w:pPr>
+      <w:r>
+        <w:t xml:space="preserve">Format du fichier :</w:t>
+      </w:r>
+    </w:p>
+    <w:p>
+      <w:r>
+        <w:t xml:space="preserve">du fichier EEG utilise
+.ncs</w:t>
+      </w:r>
+    </w:p>
+    <w:p>
+      <w:pPr>
+        <w:spacing w:before="200"/>
+      </w:pPr>
+      <w:r>
+        <w:t xml:space="preserve">PC utilisé :</w:t>
+      </w:r>
+    </w:p>
+    <w:p>
+      <w:r>
+        <w:t xml:space="preserve">utilise
+hhhhhhhhhhh</w:t>
+      </w:r>
+    </w:p>
+    <w:p>
+      <w:pPr>
+        <w:spacing w:before="200"/>
+      </w:pPr>
+      <w:r>
+        <w:t xml:space="preserve">Testeur :</w:t>
+      </w:r>
+    </w:p>
+    <w:p>
+      <w:r>
+        <w:t xml:space="preserve">hhhhhhhhhhh</w:t>
+      </w:r>
+    </w:p>
+    <w:p>
+      <w:pPr>
+        <w:spacing w:before="200"/>
+      </w:pPr>
+      <w:r>
+        <w:t xml:space="preserve">Description :</w:t>
+      </w:r>
+    </w:p>
+    <w:p>
+      <w:r>
+        <w:t xml:space="preserve">du bug
+hhhhhhhhhhh</w:t>
+      </w:r>
+    </w:p>
+    <w:p>
+      <w:pPr>
+        <w:spacing w:before="200"/>
+      </w:pPr>
+      <w:r>
+        <w:t xml:space="preserve">Étapes pour reproduire :</w:t>
+      </w:r>
+    </w:p>
+    <w:p>
+      <w:r>
+        <w:t xml:space="preserve">hhhhhhhhhhh</w:t>
+      </w:r>
+    </w:p>
+    <w:p>
+      <w:pPr>
+        <w:spacing w:before="200"/>
+      </w:pPr>
+      <w:r>
+        <w:t xml:space="preserve">Logs / Erreurs :</w:t>
+      </w:r>
+    </w:p>
+    <w:p>
+      <w:r>
+        <w:t xml:space="preserve">(copier-coller depuis le terminal)
+```shell
+```</w:t>
+      </w:r>
+    </w:p>
+    <w:p>
+      <w:pPr>
+        <w:spacing w:after="300"/>
+      </w:pPr>
+    </w:p>
+    <w:p>
+      <w:pPr>
+        <w:pStyle w:val="Heading2"/>
+        <w:spacing w:before="400" w:after="200"/>
+      </w:pPr>
+      <w:r>
+        <w:t xml:space="preserve">Issue n°40: Issue Test</w:t>
+      </w:r>
+    </w:p>
+    <w:tbl>
+      <w:tblPr>
+        <w:tblW w:type="pct" w:w="100%"/>
+        <w:tblBorders>
+          <w:top w:val="single"/>
+          <w:left w:val="single" w:color="auto" w:sz="4"/>
+          <w:bottom w:val="single"/>
+          <w:right w:val="single" w:color="auto" w:sz="4"/>
+          <w:insideH w:val="single" w:color="auto" w:sz="4"/>
+          <w:insideV w:val="single" w:color="auto" w:sz="4"/>
+        </w:tblBorders>
+      </w:tblPr>
+      <w:tblGrid>
+        <w:gridCol w:w="100"/>
+        <w:gridCol w:w="100"/>
+        <w:gridCol w:w="100"/>
+        <w:gridCol w:w="100"/>
+        <w:gridCol w:w="100"/>
+      </w:tblGrid>
+      <w:tr>
+        <w:tc>
+          <w:p>
+            <w:r>
+              <w:t xml:space="preserve">Nom</w:t>
+            </w:r>
+          </w:p>
+        </w:tc>
+        <w:tc>
+          <w:p>
+            <w:r>
+              <w:t xml:space="preserve">Date</w:t>
+            </w:r>
+          </w:p>
+        </w:tc>
+        <w:tc>
+          <w:p>
+            <w:r>
+              <w:t xml:space="preserve">Statut</w:t>
+            </w:r>
+          </w:p>
+        </w:tc>
+        <w:tc>
+          <w:p>
+            <w:r>
+              <w:t xml:space="preserve">Remarque</w:t>
+            </w:r>
+          </w:p>
+        </w:tc>
+        <w:tc>
+          <w:p>
+            <w:r>
+              <w:t xml:space="preserve">Gravité</w:t>
+            </w:r>
+          </w:p>
+        </w:tc>
+      </w:tr>
+      <w:tr>
+        <w:tc>
+          <w:p>
+            <w:r>
+              <w:t xml:space="preserve">Messaouda-H</w:t>
+            </w:r>
+          </w:p>
+        </w:tc>
+        <w:tc>
+          <w:p>
+            <w:r>
+              <w:t xml:space="preserve">31/03/2026</w:t>
+            </w:r>
+          </w:p>
+        </w:tc>
+        <w:tc>
+          <w:p>
+            <w:r>
+              <w:t xml:space="preserve">Open</w:t>
+            </w:r>
+          </w:p>
+        </w:tc>
+        <w:tc>
+          <w:p>
+            <w:r>
+              <w:t xml:space="preserve"/>
+            </w:r>
+          </w:p>
+        </w:tc>
+        <w:tc>
+          <w:p>
+            <w:r>
+              <w:t xml:space="preserve">Critique — crash / perte de donnees</w:t>
+            </w:r>
+          </w:p>
+        </w:tc>
+      </w:tr>
+    </w:tbl>
+    <w:p>
+      <w:pPr>
+        <w:spacing w:before="200"/>
+      </w:pPr>
+      <w:r>
+        <w:t xml:space="preserve">Version concernée :</w:t>
+      </w:r>
+    </w:p>
+    <w:p>
+      <w:r>
+        <w:t xml:space="preserve">Halyzia concernee
+V1.7.1</w:t>
+      </w:r>
+    </w:p>
+    <w:p>
+      <w:pPr>
+        <w:spacing w:before="200"/>
+      </w:pPr>
+      <w:r>
+        <w:t xml:space="preserve">Workflow :</w:t>
+      </w:r>
+    </w:p>
+    <w:p>
+      <w:r>
+        <w:t xml:space="preserve">en cours quand le bug est apparu
+""</w:t>
+      </w:r>
+    </w:p>
+    <w:p>
+      <w:pPr>
+        <w:spacing w:before="200"/>
+      </w:pPr>
+      <w:r>
+        <w:t xml:space="preserve">Format du fichier :</w:t>
+      </w:r>
+    </w:p>
+    <w:p>
+      <w:r>
+        <w:t xml:space="preserve">du fichier EEG utilise
+.ncs</w:t>
+      </w:r>
+    </w:p>
+    <w:p>
+      <w:pPr>
+        <w:spacing w:before="200"/>
+      </w:pPr>
+      <w:r>
+        <w:t xml:space="preserve">PC utilisé :</w:t>
+      </w:r>
+    </w:p>
+    <w:p>
+      <w:r>
+        <w:t xml:space="preserve">utilise
+Issue Test</w:t>
+      </w:r>
+    </w:p>
+    <w:p>
+      <w:pPr>
+        <w:spacing w:before="200"/>
+      </w:pPr>
+      <w:r>
+        <w:t xml:space="preserve">Testeur :</w:t>
       </w:r>
     </w:p>
     <w:p>
@@ -558,6 +905,20 @@
         <w:spacing w:before="200"/>
       </w:pPr>
       <w:r>
+        <w:t xml:space="preserve">Description :</w:t>
+      </w:r>
+    </w:p>
+    <w:p>
+      <w:r>
+        <w:t xml:space="preserve">du bug
+Issue Test</w:t>
+      </w:r>
+    </w:p>
+    <w:p>
+      <w:pPr>
+        <w:spacing w:before="200"/>
+      </w:pPr>
+      <w:r>
         <w:t xml:space="preserve">Étapes pour reproduire :</w:t>
       </w:r>
     </w:p>
@@ -571,19 +932,263 @@
         <w:spacing w:before="200"/>
       </w:pPr>
       <w:r>
-        <w:t xml:space="preserve">Logs / Traceback :</w:t>
-      </w:r>
-    </w:p>
-    <w:p>
-      <w:pPr>
-        <w:jc w:val="left"/>
-      </w:pPr>
+        <w:t xml:space="preserve">Logs / Erreurs :</w:t>
+      </w:r>
+    </w:p>
+    <w:p>
       <w:r>
         <w:t xml:space="preserve">(copier-coller depuis le terminal)
 ```shell
 Issue Test
 ```</w:t>
       </w:r>
+    </w:p>
+    <w:p>
+      <w:pPr>
+        <w:spacing w:after="300"/>
+      </w:pPr>
+    </w:p>
+    <w:p>
+      <w:pPr>
+        <w:pStyle w:val="Heading2"/>
+        <w:spacing w:before="400" w:after="200"/>
+      </w:pPr>
+      <w:r>
+        <w:t xml:space="preserve">Issue n°39: it will work</w:t>
+      </w:r>
+    </w:p>
+    <w:tbl>
+      <w:tblPr>
+        <w:tblW w:type="pct" w:w="100%"/>
+        <w:tblBorders>
+          <w:top w:val="single"/>
+          <w:left w:val="single" w:color="auto" w:sz="4"/>
+          <w:bottom w:val="single"/>
+          <w:right w:val="single" w:color="auto" w:sz="4"/>
+          <w:insideH w:val="single" w:color="auto" w:sz="4"/>
+          <w:insideV w:val="single" w:color="auto" w:sz="4"/>
+        </w:tblBorders>
+      </w:tblPr>
+      <w:tblGrid>
+        <w:gridCol w:w="100"/>
+        <w:gridCol w:w="100"/>
+        <w:gridCol w:w="100"/>
+        <w:gridCol w:w="100"/>
+        <w:gridCol w:w="100"/>
+      </w:tblGrid>
+      <w:tr>
+        <w:tc>
+          <w:p>
+            <w:r>
+              <w:t xml:space="preserve">Nom</w:t>
+            </w:r>
+          </w:p>
+        </w:tc>
+        <w:tc>
+          <w:p>
+            <w:r>
+              <w:t xml:space="preserve">Date</w:t>
+            </w:r>
+          </w:p>
+        </w:tc>
+        <w:tc>
+          <w:p>
+            <w:r>
+              <w:t xml:space="preserve">Statut</w:t>
+            </w:r>
+          </w:p>
+        </w:tc>
+        <w:tc>
+          <w:p>
+            <w:r>
+              <w:t xml:space="preserve">Remarque</w:t>
+            </w:r>
+          </w:p>
+        </w:tc>
+        <w:tc>
+          <w:p>
+            <w:r>
+              <w:t xml:space="preserve">Gravité</w:t>
+            </w:r>
+          </w:p>
+        </w:tc>
+      </w:tr>
+      <w:tr>
+        <w:tc>
+          <w:p>
+            <w:r>
+              <w:t xml:space="preserve">Messaouda-H</w:t>
+            </w:r>
+          </w:p>
+        </w:tc>
+        <w:tc>
+          <w:p>
+            <w:r>
+              <w:t xml:space="preserve">30/03/2026</w:t>
+            </w:r>
+          </w:p>
+        </w:tc>
+        <w:tc>
+          <w:p>
+            <w:r>
+              <w:t xml:space="preserve">Open</w:t>
+            </w:r>
+          </w:p>
+        </w:tc>
+        <w:tc>
+          <w:p>
+            <w:r>
+              <w:t xml:space="preserve"/>
+            </w:r>
+          </w:p>
+        </w:tc>
+        <w:tc>
+          <w:p>
+            <w:r>
+              <w:t xml:space="preserve">Mineur</w:t>
+            </w:r>
+          </w:p>
+        </w:tc>
+      </w:tr>
+    </w:tbl>
+    <w:p>
+      <w:pPr>
+        <w:spacing w:before="200"/>
+      </w:pPr>
+      <w:r>
+        <w:t xml:space="preserve">Description :</w:t>
+      </w:r>
+    </w:p>
+    <w:p>
+      <w:r>
+        <w:t xml:space="preserve">it will work</w:t>
+      </w:r>
+    </w:p>
+    <w:p>
+      <w:pPr>
+        <w:spacing w:after="300"/>
+      </w:pPr>
+    </w:p>
+    <w:p>
+      <w:pPr>
+        <w:pStyle w:val="Heading2"/>
+        <w:spacing w:before="400" w:after="200"/>
+      </w:pPr>
+      <w:r>
+        <w:t xml:space="preserve">Issue n°38: back_log_mima_last</w:t>
+      </w:r>
+    </w:p>
+    <w:tbl>
+      <w:tblPr>
+        <w:tblW w:type="pct" w:w="100%"/>
+        <w:tblBorders>
+          <w:top w:val="single"/>
+          <w:left w:val="single" w:color="auto" w:sz="4"/>
+          <w:bottom w:val="single"/>
+          <w:right w:val="single" w:color="auto" w:sz="4"/>
+          <w:insideH w:val="single" w:color="auto" w:sz="4"/>
+          <w:insideV w:val="single" w:color="auto" w:sz="4"/>
+        </w:tblBorders>
+      </w:tblPr>
+      <w:tblGrid>
+        <w:gridCol w:w="100"/>
+        <w:gridCol w:w="100"/>
+        <w:gridCol w:w="100"/>
+        <w:gridCol w:w="100"/>
+        <w:gridCol w:w="100"/>
+      </w:tblGrid>
+      <w:tr>
+        <w:tc>
+          <w:p>
+            <w:r>
+              <w:t xml:space="preserve">Nom</w:t>
+            </w:r>
+          </w:p>
+        </w:tc>
+        <w:tc>
+          <w:p>
+            <w:r>
+              <w:t xml:space="preserve">Date</w:t>
+            </w:r>
+          </w:p>
+        </w:tc>
+        <w:tc>
+          <w:p>
+            <w:r>
+              <w:t xml:space="preserve">Statut</w:t>
+            </w:r>
+          </w:p>
+        </w:tc>
+        <w:tc>
+          <w:p>
+            <w:r>
+              <w:t xml:space="preserve">Remarque</w:t>
+            </w:r>
+          </w:p>
+        </w:tc>
+        <w:tc>
+          <w:p>
+            <w:r>
+              <w:t xml:space="preserve">Gravité</w:t>
+            </w:r>
+          </w:p>
+        </w:tc>
+      </w:tr>
+      <w:tr>
+        <w:tc>
+          <w:p>
+            <w:r>
+              <w:t xml:space="preserve">Messaouda-H</w:t>
+            </w:r>
+          </w:p>
+        </w:tc>
+        <w:tc>
+          <w:p>
+            <w:r>
+              <w:t xml:space="preserve">30/03/2026</w:t>
+            </w:r>
+          </w:p>
+        </w:tc>
+        <w:tc>
+          <w:p>
+            <w:r>
+              <w:t xml:space="preserve">Open</w:t>
+            </w:r>
+          </w:p>
+        </w:tc>
+        <w:tc>
+          <w:p>
+            <w:r>
+              <w:t xml:space="preserve"/>
+            </w:r>
+          </w:p>
+        </w:tc>
+        <w:tc>
+          <w:p>
+            <w:r>
+              <w:t xml:space="preserve">Mineur</w:t>
+            </w:r>
+          </w:p>
+        </w:tc>
+      </w:tr>
+    </w:tbl>
+    <w:p>
+      <w:pPr>
+        <w:spacing w:before="200"/>
+      </w:pPr>
+      <w:r>
+        <w:t xml:space="preserve">Description :</w:t>
+      </w:r>
+    </w:p>
+    <w:p>
+      <w:r>
+        <w:t xml:space="preserve">mima log</w:t>
+      </w:r>
+    </w:p>
+    <w:p>
+      <w:pPr>
+        <w:spacing w:after="300"/>
+      </w:pPr>
     </w:p>
     <w:sectPr>
       <w:pgSz w:w="11906" w:h="16838" w:orient="portrait"/>

</xml_diff>